<commit_message>
Add deterministic neural compatibility probes
</commit_message>
<xml_diff>
--- a/manuscript/stage2_manuscript_v2.docx
+++ b/manuscript/stage2_manuscript_v2.docx
@@ -40,7 +40,7 @@
     </w:p>
     <w:p>
       <w:r>
-        <w:t>Clinical metagenomic next-generation sequencing (mNGS) often produces short or quality-trimmed reads, yet DNA representations are still commonly judged by downstream accuracy alone. This can obscure which information an encoding preserves before any classifier is trained. We present a controlled representation-diagnostics framework for ultra-short DNA reads and define canonical spaced-property encoding (CSP), a deterministic feature block that combines reverse-complement canonical spaced-seed counts with interpretable biochemical summaries. Across a close-relative WGS-slice grid spanning 69, 75, 100, 110, 125, 150 bp and a PE150 proxy, CSP was the top clean-perturbed stability representation in 42 of 42 length-by-perturbation settings. At 69 bp, CSP achieved mean paired cosine of 0.994 under 3% N masking and 0.988 under a 6-bp local mismatch, compared with 0.940 and 0.877 for canonical 5-mers. This advantage did not translate into universal species or resistance accuracy: canonical k-mers remained strong high-resolution identity baselines in close-relative and ARG/SNP probes. A dense context-visibility diagnostic further showed that apparent read-length thresholds depend on motif position, with motif-pair visibility emerging at 130, 140, 148 or 155 bp under different placements. These results support a bounded conclusion: short-read DNA pipelines should separate exact identity evidence from compact perturbation-stable auxiliary evidence, rather than ranking representations by a single accuracy number.</w:t>
+        <w:t>Clinical metagenomic next-generation sequencing (mNGS) often produces short or quality-trimmed reads, yet DNA representations are still commonly judged by downstream accuracy alone. This can obscure which information an encoding preserves before any classifier is trained. We present a controlled representation-diagnostics framework for ultra-short DNA reads and define canonical spaced-property encoding (CSP), a deterministic feature block that combines reverse-complement canonical spaced-seed counts with interpretable biochemical summaries. Across a close-relative WGS-slice grid spanning 69, 75, 100, 110, 125, 150 bp and a PE150 proxy, CSP was the top clean-perturbed stability representation in 42 of 42 length-by-perturbation settings. At 69 bp, CSP achieved mean paired cosine of 0.994 under 3% N masking and 0.988 under a 6-bp local mismatch, compared with 0.940 and 0.877 for canonical 5-mers. This advantage did not translate into universal species or resistance accuracy: canonical k-mers remained strong high-resolution identity baselines in close-relative and ARG/SNP probes. A dense context-visibility diagnostic further showed that apparent read-length thresholds depend on motif position, with motif-pair visibility emerging at 130, 140, 148 or 155 bp under different placements. Deterministic neural probes further showed that small CNN and tiny Transformer readouts were task-dependent rather than universally superior. These results support a bounded conclusion: short-read DNA pipelines should separate exact identity evidence from compact perturbation-stable auxiliary evidence, rather than ranking representations by a single accuracy number.</w:t>
       </w:r>
     </w:p>
     <w:p>
@@ -68,7 +68,7 @@
     </w:p>
     <w:p>
       <w:r>
-        <w:t>Here we propose a controlled information-preservation study rather than a final clinical classifier. Our central claim is not that CSP replaces canonical k-mers. Instead, canonical k-mers provide high-resolution identity evidence, whereas CSP provides compact, strand-friendly and perturbation-stable auxiliary evidence. We evaluate this claim using WGS-derived close-relative reads, hospital-like 69/75 bp perturbation grids, CSP component ablation, k and spaced-pattern sensitivity, lightweight readout probes, synthetic ARG/SNP boundary tasks and attention-style context-visibility diagnostics.</w:t>
+        <w:t>Here we propose a controlled information-preservation study rather than a final clinical classifier. Our central claim is not that CSP replaces canonical k-mers. Instead, canonical k-mers provide high-resolution identity evidence, whereas CSP provides compact, strand-friendly and perturbation-stable auxiliary evidence. We evaluate this claim using WGS-derived close-relative reads, hospital-like 69/75 bp perturbation grids, CSP component ablation, k and spaced-pattern sensitivity, lightweight readout probes, deterministic neural compatibility probes, synthetic ARG/SNP boundary tasks and attention-style context-visibility diagnostics.</w:t>
       </w:r>
     </w:p>
     <w:p>
@@ -268,6 +268,11 @@
       </w:r>
     </w:p>
     <w:p>
+      <w:r>
+        <w:t>The neural compatibility probe used PyTorch CPU with deterministic seeds and single-thread execution. It compared tabular MLP readouts for canonical 5-mer, CSP and hybrid vectors with 1D-CNN and one-layer tiny Transformer readouts over one-hot or property channels. The probe covered 69, 75, 100 and 150 bp reads, clean/N-masked/combined-perturbation conditions, target/background classification, global species stress classification and an Enterobacter within-genus species task. It was designed to test model-readability, not clinical accuracy.</w:t>
+      </w:r>
+    </w:p>
+    <w:p>
       <w:pPr>
         <w:pStyle w:val="Heading1"/>
       </w:pPr>
@@ -5383,6 +5388,79 @@
         <w:pStyle w:val="Heading2"/>
       </w:pPr>
       <w:r>
+        <w:t>Deterministic neural probes showed model compatibility, not neural superiority</w:t>
+      </w:r>
+    </w:p>
+    <w:p>
+      <w:r>
+        <w:t>The additional PyTorch probe trained 252 small neural readouts with fixed seeds. It did not support a broad claim that CNNs or tiny Transformers automatically improve ultra-short read interpretation. In target/background probes, 1D-CNN over one-hot channels had the highest mean macro-F1, while CSP read by a tabular MLP was close and used only 147 features on average. In global species and within-genus Enterobacter stress probes, the best small models were tabular MLPs over canonical or hybrid vectors, and absolute macro-F1 values remained low. This supports a practical model-matching interpretation: CSP is a natural compact tabular auxiliary input, whereas one-hot or property channels are more appropriate when a CNN or attention model is explicitly trained.</w:t>
+      </w:r>
+    </w:p>
+    <w:p>
+      <w:r>
+        <w:rPr>
+          <w:i/>
+          <w:sz w:val="18"/>
+        </w:rPr>
+        <w:t>Table omitted from the DOCX body for layout stability; the full table is available in the Markdown manuscript and stage-2 table files (21 rows, 8 columns).</w:t>
+      </w:r>
+    </w:p>
+    <w:p>
+      <w:pPr>
+        <w:jc w:val="center"/>
+      </w:pPr>
+      <w:r>
+        <w:drawing>
+          <wp:inline xmlns:a="http://schemas.openxmlformats.org/drawingml/2006/main" xmlns:pic="http://schemas.openxmlformats.org/drawingml/2006/picture">
+            <wp:extent cx="5760720" cy="1937400"/>
+            <wp:docPr id="5" name="Picture 5"/>
+            <wp:cNvGraphicFramePr>
+              <a:graphicFrameLocks noChangeAspect="1"/>
+            </wp:cNvGraphicFramePr>
+            <a:graphic>
+              <a:graphicData uri="http://schemas.openxmlformats.org/drawingml/2006/picture">
+                <pic:pic>
+                  <pic:nvPicPr>
+                    <pic:cNvPr id="0" name="stage2_fig_neural_compatibility.png"/>
+                    <pic:cNvPicPr/>
+                  </pic:nvPicPr>
+                  <pic:blipFill>
+                    <a:blip r:embed="rId14"/>
+                    <a:stretch>
+                      <a:fillRect/>
+                    </a:stretch>
+                  </pic:blipFill>
+                  <pic:spPr>
+                    <a:xfrm>
+                      <a:off x="0" y="0"/>
+                      <a:ext cx="5760720" cy="1937400"/>
+                    </a:xfrm>
+                    <a:prstGeom prst="rect"/>
+                  </pic:spPr>
+                </pic:pic>
+              </a:graphicData>
+            </a:graphic>
+          </wp:inline>
+        </w:drawing>
+      </w:r>
+    </w:p>
+    <w:p>
+      <w:pPr>
+        <w:jc w:val="center"/>
+      </w:pPr>
+      <w:r>
+        <w:rPr>
+          <w:i/>
+          <w:sz w:val="18"/>
+        </w:rPr>
+        <w:t>Figure 5. Deterministic neural compatibility probes.</w:t>
+      </w:r>
+    </w:p>
+    <w:p>
+      <w:pPr>
+        <w:pStyle w:val="Heading2"/>
+      </w:pPr>
+      <w:r>
         <w:t>Context loss around 125-150 bp was position-dependent, not a single read-length threshold</w:t>
       </w:r>
     </w:p>
@@ -5808,7 +5886,7 @@
         <w:drawing>
           <wp:inline xmlns:a="http://schemas.openxmlformats.org/drawingml/2006/main" xmlns:pic="http://schemas.openxmlformats.org/drawingml/2006/picture">
             <wp:extent cx="5760720" cy="3116788"/>
-            <wp:docPr id="5" name="Picture 5"/>
+            <wp:docPr id="6" name="Picture 6"/>
             <wp:cNvGraphicFramePr>
               <a:graphicFrameLocks noChangeAspect="1"/>
             </wp:cNvGraphicFramePr>
@@ -5820,7 +5898,7 @@
                     <pic:cNvPicPr/>
                   </pic:nvPicPr>
                   <pic:blipFill>
-                    <a:blip r:embed="rId14"/>
+                    <a:blip r:embed="rId15"/>
                     <a:stretch>
                       <a:fillRect/>
                     </a:stretch>
@@ -5848,7 +5926,7 @@
           <w:i/>
           <w:sz w:val="18"/>
         </w:rPr>
-        <w:t>Figure 5. Attention-style context visibility breakpoints.</w:t>
+        <w:t>Figure 6. Attention-style context visibility breakpoints.</w:t>
       </w:r>
     </w:p>
     <w:p>
@@ -5859,7 +5937,7 @@
         <w:drawing>
           <wp:inline xmlns:a="http://schemas.openxmlformats.org/drawingml/2006/main" xmlns:pic="http://schemas.openxmlformats.org/drawingml/2006/picture">
             <wp:extent cx="5760720" cy="3112667"/>
-            <wp:docPr id="6" name="Picture 6"/>
+            <wp:docPr id="7" name="Picture 7"/>
             <wp:cNvGraphicFramePr>
               <a:graphicFrameLocks noChangeAspect="1"/>
             </wp:cNvGraphicFramePr>
@@ -5871,7 +5949,7 @@
                     <pic:cNvPicPr/>
                   </pic:nvPicPr>
                   <pic:blipFill>
-                    <a:blip r:embed="rId15"/>
+                    <a:blip r:embed="rId16"/>
                     <a:stretch>
                       <a:fillRect/>
                     </a:stretch>
@@ -5899,7 +5977,7 @@
           <w:i/>
           <w:sz w:val="18"/>
         </w:rPr>
-        <w:t>Figure 6. Best readout transitions around motif visibility.</w:t>
+        <w:t>Figure 7. Best readout transitions around motif visibility.</w:t>
       </w:r>
     </w:p>
     <w:p>
@@ -9234,7 +9312,7 @@
         <w:drawing>
           <wp:inline xmlns:a="http://schemas.openxmlformats.org/drawingml/2006/main" xmlns:pic="http://schemas.openxmlformats.org/drawingml/2006/picture">
             <wp:extent cx="5760720" cy="2012332"/>
-            <wp:docPr id="7" name="Picture 7"/>
+            <wp:docPr id="8" name="Picture 8"/>
             <wp:cNvGraphicFramePr>
               <a:graphicFrameLocks noChangeAspect="1"/>
             </wp:cNvGraphicFramePr>
@@ -9246,7 +9324,7 @@
                     <pic:cNvPicPr/>
                   </pic:nvPicPr>
                   <pic:blipFill>
-                    <a:blip r:embed="rId16"/>
+                    <a:blip r:embed="rId17"/>
                     <a:stretch>
                       <a:fillRect/>
                     </a:stretch>
@@ -9274,7 +9352,7 @@
           <w:i/>
           <w:sz w:val="18"/>
         </w:rPr>
-        <w:t>Figure 7. ARG/SNP boundary readout probes.</w:t>
+        <w:t>Figure 8. ARG/SNP boundary readout probes.</w:t>
       </w:r>
     </w:p>
     <w:p>
@@ -9302,7 +9380,7 @@
     </w:p>
     <w:p>
       <w:r>
-        <w:t>Several conclusions remain deliberately unproven. We did not train a full Transformer or CNN on realistic clinical mNGS data. We did not benchmark Kraken2, Centrifuge, Kaiju or alignment pipelines on the same noisy FASTQ inputs. We did not use real CARD, ResFinder or AMRFinderPlus marker panels for ARG calling. These are appropriate server-stage experiments. The local experiments establish the representation-level evidence needed to justify those larger tests.</w:t>
+        <w:t>Several conclusions remain deliberately unproven. The neural probe was intentionally small and local; it does not establish CNN or Transformer superiority on realistic clinical mNGS data. We did not benchmark Kraken2, Centrifuge, Kaiju or alignment pipelines on the same noisy FASTQ inputs. We did not use real CARD, ResFinder or AMRFinderPlus marker panels for ARG calling. These are appropriate server-stage experiments. The local experiments establish the representation-level evidence needed to justify those larger tests.</w:t>
       </w:r>
     </w:p>
     <w:p>

</xml_diff>

<commit_message>
Prepare submission manuscript and literature briefing
</commit_message>
<xml_diff>
--- a/manuscript/stage2_manuscript_v2.docx
+++ b/manuscript/stage2_manuscript_v2.docx
@@ -27,6 +27,18 @@
           <w:sz w:val="21"/>
         </w:rPr>
         <w:t>Canonical k-mers preserve high-resolution identity evidence, whereas canonical spaced-property encoding provides compact perturbation-stable auxiliary evidence for mNGS-like reads</w:t>
+      </w:r>
+    </w:p>
+    <w:p>
+      <w:pPr>
+        <w:jc w:val="center"/>
+      </w:pPr>
+      <w:r>
+        <w:rPr>
+          <w:rFonts w:ascii="Arial" w:hAnsi="Arial"/>
+          <w:sz w:val="21"/>
+        </w:rPr>
+        <w:t>MEI ruixiang</w:t>
       </w:r>
     </w:p>
     <w:p/>
@@ -9406,7 +9418,7 @@
     </w:p>
     <w:p>
       <w:r>
-        <w:t>All code, generated lightweight reads, result tables, figures and manuscript builders are maintained in the project repository. Random seeds are fixed in the stage-2 scripts, and the earlier manuscript/results snapshot was preserved as an internal project archive before the stage-2 rerun. A public release should include the executable scripts, configuration files, generated summary tables and exact commit hash used for the submitted manuscript.</w:t>
+        <w:t>All code, generated lightweight reads, result tables, figures and manuscript builders are maintained in the project repository (https://github.com/FairYJmrx/ultrashort-dna-representation-diagnostics; release tag v0.2-stage2-mei-submission; exact commit hash to be reported from the public archive or cover letter at submission). Random seeds are fixed in the stage-2 scripts, and the earlier manuscript/results snapshot was preserved as an internal project archive before the stage-2 rerun. The submitted code package includes executable scripts, configuration files, generated summary tables, figures, manuscript builders and the 21-genome close-relative WGS-slice manifest; bulky downloaded reference FASTA files are intentionally excluded and can be regenerated from the manifest and preparation scripts. If journal policy requires public access, the private repository should be made public or archived with a DOI after double-blind constraints are resolved.</w:t>
       </w:r>
     </w:p>
     <w:p>

</xml_diff>

<commit_message>
Correct author capitalization in submission manuscript
</commit_message>
<xml_diff>
--- a/manuscript/stage2_manuscript_v2.docx
+++ b/manuscript/stage2_manuscript_v2.docx
@@ -38,7 +38,7 @@
           <w:rFonts w:ascii="Arial" w:hAnsi="Arial"/>
           <w:sz w:val="21"/>
         </w:rPr>
-        <w:t>MEI ruixiang</w:t>
+        <w:t>MEI Ruixiang</w:t>
       </w:r>
     </w:p>
     <w:p/>
@@ -9418,7 +9418,7 @@
     </w:p>
     <w:p>
       <w:r>
-        <w:t>All code, generated lightweight reads, result tables, figures and manuscript builders are maintained in the project repository (https://github.com/FairYJmrx/ultrashort-dna-representation-diagnostics; release tag v0.2-stage2-mei-submission; exact commit hash to be reported from the public archive or cover letter at submission). Random seeds are fixed in the stage-2 scripts, and the earlier manuscript/results snapshot was preserved as an internal project archive before the stage-2 rerun. The submitted code package includes executable scripts, configuration files, generated summary tables, figures, manuscript builders and the 21-genome close-relative WGS-slice manifest; bulky downloaded reference FASTA files are intentionally excluded and can be regenerated from the manifest and preparation scripts. If journal policy requires public access, the private repository should be made public or archived with a DOI after double-blind constraints are resolved.</w:t>
+        <w:t>All code, generated lightweight reads, result tables, figures and manuscript builders are maintained in the project repository (https://github.com/FairYJmrx/ultrashort-dna-representation-diagnostics; release tag v0.2.1-stage2-mei-submission; exact commit hash to be reported from the public archive or cover letter at submission). Random seeds are fixed in the stage-2 scripts, and the earlier manuscript/results snapshot was preserved as an internal project archive before the stage-2 rerun. The submitted code package includes executable scripts, configuration files, generated summary tables, figures, manuscript builders and the 21-genome close-relative WGS-slice manifest; bulky downloaded reference FASTA files are intentionally excluded and can be regenerated from the manifest and preparation scripts. If journal policy requires public access, the private repository should be made public or archived with a DOI after double-blind constraints are resolved.</w:t>
       </w:r>
     </w:p>
     <w:p>

</xml_diff>